<commit_message>
Fix macOS nproc compatibility; update ff name in Methods; add HIE-renamed PDB
- setup_topology.sh: replace nproc with sysctl-based NCPU (macOS/Linux compat)
- Methods_1TSR_Carvacrol_MD.docx: amber14sb → AMBER99SB-ILDN (2 occurrences)
- Add 1TSR_chainA_H.pdb: all HIS pre-renamed to HIE (pdb2gmx stdin workaround)

Local equilibration complete: EM → NVT (100 ps) → NPT (1 ns) at 310 K/1 bar.
Ready for TRUBA 1 µs production MD.

Co-Authored-By: Claude Sonnet 4.6 <noreply@anthropic.com>
</commit_message>
<xml_diff>
--- a/Methods_1TSR_Carvacrol_MD.docx
+++ b/Methods_1TSR_Carvacrol_MD.docx
@@ -453,7 +453,7 @@
           <w:i w:val="0"/>
           <w:sz w:val="24"/>
         </w:rPr>
-        <w:t xml:space="preserve"> 2024.1 (Abraham et al., 2015), compiled with Intel oneAPI 2024 optimizations. The protein was described by the AMBER14SB force field (Maier et al., 2015), and the ligand was described by GAFF2 parameters as described in Section 2.2. The protein–ligand complex was assembled by combining the GROMACS coordinate files generated by </w:t>
+        <w:t xml:space="preserve"> 2024.1 (Abraham et al., 2015), compiled with Intel oneAPI 2024 optimizations. The protein was described by the AMBER99SB-ILDN force field (Maier et al., 2015), and the ligand was described by GAFF2 parameters as described in Section 2.2. The protein–ligand complex was assembled by combining the GROMACS coordinate files generated by </w:t>
       </w:r>
       <w:r>
         <w:rPr>
@@ -1124,7 +1124,7 @@
                 <w:rFonts w:ascii="Times New Roman" w:hAnsi="Times New Roman"/>
                 <w:sz w:val="20"/>
               </w:rPr>
-              <w:t>AMBER14SB FF</w:t>
+              <w:t>AMBER99SB-ILDN FF</w:t>
             </w:r>
           </w:p>
         </w:tc>

</xml_diff>